<commit_message>
Nothing new x 2
</commit_message>
<xml_diff>
--- a/Documentation/MSLLStructureRU.docx
+++ b/Documentation/MSLLStructureRU.docx
@@ -53,8 +53,9 @@
           <w:szCs w:val="40"/>
           <w:lang w:val="en-US"/>
         </w:rPr>
-        <w:t>By nirinis</w:t>
-      </w:r>
+        <w:t xml:space="preserve">By </w:t>
+      </w:r>
+      <w:proofErr w:type="spellStart"/>
       <w:r>
         <w:rPr>
           <w:rFonts w:ascii="Agency FB" w:hAnsi="Agency FB"/>
@@ -66,24 +67,38 @@
           <w:szCs w:val="40"/>
           <w:lang w:val="en-US"/>
         </w:rPr>
-        <w:br w:type="page"/>
-      </w:r>
-    </w:p>
-    <w:p>
-      <w:pPr>
-        <w:pStyle w:val="1"/>
-        <w:rPr>
-          <w:rFonts w:ascii="Bahnschrift" w:hAnsi="Bahnschrift"/>
+        <w:t>nirinis</w:t>
+      </w:r>
+      <w:proofErr w:type="spellEnd"/>
+      <w:r>
+        <w:rPr>
+          <w:rFonts w:ascii="Agency FB" w:hAnsi="Agency FB"/>
+          <w:b/>
+          <w:bCs/>
+          <w:i/>
+          <w:iCs/>
           <w:sz w:val="40"/>
           <w:szCs w:val="40"/>
-        </w:rPr>
-      </w:pPr>
-      <w:r>
+          <w:lang w:val="en-US"/>
+        </w:rPr>
+        <w:br w:type="page"/>
+      </w:r>
+    </w:p>
+    <w:p>
+      <w:pPr>
+        <w:pStyle w:val="1"/>
         <w:rPr>
           <w:rFonts w:ascii="Bahnschrift" w:hAnsi="Bahnschrift"/>
           <w:sz w:val="40"/>
           <w:szCs w:val="40"/>
         </w:rPr>
+      </w:pPr>
+      <w:r>
+        <w:rPr>
+          <w:rFonts w:ascii="Bahnschrift" w:hAnsi="Bahnschrift"/>
+          <w:sz w:val="40"/>
+          <w:szCs w:val="40"/>
+        </w:rPr>
         <w:lastRenderedPageBreak/>
         <w:t>Зачем</w:t>
       </w:r>
@@ -139,6 +154,7 @@
         </w:rPr>
         <w:t xml:space="preserve">: </w:t>
       </w:r>
+      <w:proofErr w:type="spellStart"/>
       <w:r>
         <w:rPr>
           <w:rFonts w:ascii="Bahnschrift" w:hAnsi="Bahnschrift"/>
@@ -148,6 +164,7 @@
         </w:rPr>
         <w:t>mslmo</w:t>
       </w:r>
+      <w:proofErr w:type="spellEnd"/>
       <w:r>
         <w:rPr>
           <w:rFonts w:ascii="Bahnschrift" w:hAnsi="Bahnschrift"/>
@@ -164,6 +181,7 @@
         </w:rPr>
         <w:t xml:space="preserve">и </w:t>
       </w:r>
+      <w:proofErr w:type="spellStart"/>
       <w:r>
         <w:rPr>
           <w:rFonts w:ascii="Bahnschrift" w:hAnsi="Bahnschrift"/>
@@ -173,6 +191,7 @@
         </w:rPr>
         <w:t>mslco</w:t>
       </w:r>
+      <w:proofErr w:type="spellEnd"/>
       <w:r>
         <w:rPr>
           <w:rFonts w:ascii="Bahnschrift" w:hAnsi="Bahnschrift"/>
@@ -296,15 +315,43 @@
           <w:sz w:val="28"/>
           <w:szCs w:val="28"/>
         </w:rPr>
-        <w:t xml:space="preserve">, разбор синтаксиса и платформонезависимые </w:t>
-      </w:r>
-      <w:r>
-        <w:rPr>
-          <w:rFonts w:ascii="Bahnschrift" w:hAnsi="Bahnschrift"/>
-          <w:sz w:val="28"/>
-          <w:szCs w:val="28"/>
-        </w:rPr>
-        <w:t xml:space="preserve">оптимизизация </w:t>
+        <w:t xml:space="preserve">, разбор синтаксиса и </w:t>
+      </w:r>
+      <w:proofErr w:type="spellStart"/>
+      <w:r>
+        <w:rPr>
+          <w:rFonts w:ascii="Bahnschrift" w:hAnsi="Bahnschrift"/>
+          <w:sz w:val="28"/>
+          <w:szCs w:val="28"/>
+        </w:rPr>
+        <w:t>платформонезависимые</w:t>
+      </w:r>
+      <w:proofErr w:type="spellEnd"/>
+      <w:r>
+        <w:rPr>
+          <w:rFonts w:ascii="Bahnschrift" w:hAnsi="Bahnschrift"/>
+          <w:sz w:val="28"/>
+          <w:szCs w:val="28"/>
+        </w:rPr>
+        <w:t xml:space="preserve"> </w:t>
+      </w:r>
+      <w:proofErr w:type="spellStart"/>
+      <w:r>
+        <w:rPr>
+          <w:rFonts w:ascii="Bahnschrift" w:hAnsi="Bahnschrift"/>
+          <w:sz w:val="28"/>
+          <w:szCs w:val="28"/>
+        </w:rPr>
+        <w:t>оптимизизация</w:t>
+      </w:r>
+      <w:proofErr w:type="spellEnd"/>
+      <w:r>
+        <w:rPr>
+          <w:rFonts w:ascii="Bahnschrift" w:hAnsi="Bahnschrift"/>
+          <w:sz w:val="28"/>
+          <w:szCs w:val="28"/>
+        </w:rPr>
+        <w:t xml:space="preserve"> </w:t>
       </w:r>
       <w:r>
         <w:rPr>
@@ -487,6 +534,7 @@
         </w:rPr>
         <w:t xml:space="preserve"> – это консольное приложение (по крайней мере, в первом обличии), которое на вход принимает путь к </w:t>
       </w:r>
+      <w:proofErr w:type="spellStart"/>
       <w:r>
         <w:rPr>
           <w:rFonts w:ascii="Bahnschrift" w:hAnsi="Bahnschrift"/>
@@ -496,6 +544,7 @@
         </w:rPr>
         <w:t>mslmo</w:t>
       </w:r>
+      <w:proofErr w:type="spellEnd"/>
       <w:r>
         <w:rPr>
           <w:rFonts w:ascii="Bahnschrift" w:hAnsi="Bahnschrift"/>
@@ -504,6 +553,7 @@
         </w:rPr>
         <w:t xml:space="preserve">, версию </w:t>
       </w:r>
+      <w:proofErr w:type="spellStart"/>
       <w:r>
         <w:rPr>
           <w:rFonts w:ascii="Bahnschrift" w:hAnsi="Bahnschrift"/>
@@ -513,6 +563,7 @@
         </w:rPr>
         <w:t>vm</w:t>
       </w:r>
+      <w:proofErr w:type="spellEnd"/>
       <w:r>
         <w:rPr>
           <w:rFonts w:ascii="Bahnschrift" w:hAnsi="Bahnschrift"/>
@@ -552,6 +603,7 @@
         </w:rPr>
         <w:t xml:space="preserve">Обрабатываем файл </w:t>
       </w:r>
+      <w:proofErr w:type="spellStart"/>
       <w:r>
         <w:rPr>
           <w:rFonts w:ascii="Bahnschrift" w:hAnsi="Bahnschrift"/>
@@ -561,6 +613,7 @@
         </w:rPr>
         <w:t>mslmo</w:t>
       </w:r>
+      <w:proofErr w:type="spellEnd"/>
       <w:r>
         <w:rPr>
           <w:rFonts w:ascii="Bahnschrift" w:hAnsi="Bahnschrift"/>
@@ -730,6 +783,7 @@
         </w:rPr>
         <w:t xml:space="preserve">Строим массив </w:t>
       </w:r>
+      <w:proofErr w:type="spellStart"/>
       <w:r>
         <w:rPr>
           <w:rFonts w:ascii="Bahnschrift" w:hAnsi="Bahnschrift"/>
@@ -739,6 +793,7 @@
         </w:rPr>
         <w:t>ByteCommand</w:t>
       </w:r>
+      <w:proofErr w:type="spellEnd"/>
       <w:r>
         <w:rPr>
           <w:rFonts w:ascii="Bahnschrift" w:hAnsi="Bahnschrift"/>
@@ -787,6 +842,7 @@
         </w:rPr>
         <w:t xml:space="preserve">Исходя из версии </w:t>
       </w:r>
+      <w:proofErr w:type="spellStart"/>
       <w:r>
         <w:rPr>
           <w:rFonts w:ascii="Bahnschrift" w:hAnsi="Bahnschrift"/>
@@ -796,6 +852,7 @@
         </w:rPr>
         <w:t>vm</w:t>
       </w:r>
+      <w:proofErr w:type="spellEnd"/>
       <w:r>
         <w:rPr>
           <w:rFonts w:ascii="Bahnschrift" w:hAnsi="Bahnschrift"/>
@@ -804,6 +861,7 @@
         </w:rPr>
         <w:t xml:space="preserve">, например, </w:t>
       </w:r>
+      <w:proofErr w:type="spellStart"/>
       <w:r>
         <w:rPr>
           <w:rFonts w:ascii="Bahnschrift" w:hAnsi="Bahnschrift"/>
@@ -813,6 +871,7 @@
         </w:rPr>
         <w:t>mslvm</w:t>
       </w:r>
+      <w:proofErr w:type="spellEnd"/>
       <w:r>
         <w:rPr>
           <w:rFonts w:ascii="Bahnschrift" w:hAnsi="Bahnschrift"/>
@@ -845,6 +904,7 @@
         </w:rPr>
         <w:t xml:space="preserve">обработки массива </w:t>
       </w:r>
+      <w:proofErr w:type="spellStart"/>
       <w:r>
         <w:rPr>
           <w:rFonts w:ascii="Bahnschrift" w:hAnsi="Bahnschrift"/>
@@ -854,6 +914,7 @@
         </w:rPr>
         <w:t>ByteCommand</w:t>
       </w:r>
+      <w:proofErr w:type="spellEnd"/>
       <w:r>
         <w:rPr>
           <w:rFonts w:ascii="Bahnschrift" w:hAnsi="Bahnschrift"/>
@@ -883,7 +944,25 @@
           <w:sz w:val="28"/>
           <w:szCs w:val="28"/>
         </w:rPr>
-        <w:t>Код храним в ОЗУ, а не сохраняем в ПЗУ ради экономии, так как может понадобиться постпроцессинг.</w:t>
+        <w:t xml:space="preserve">Код храним в ОЗУ, а не сохраняем в ПЗУ ради экономии, так как может понадобиться </w:t>
+      </w:r>
+      <w:proofErr w:type="spellStart"/>
+      <w:r>
+        <w:rPr>
+          <w:rFonts w:ascii="Bahnschrift" w:hAnsi="Bahnschrift"/>
+          <w:sz w:val="28"/>
+          <w:szCs w:val="28"/>
+        </w:rPr>
+        <w:t>постпроцессинг</w:t>
+      </w:r>
+      <w:proofErr w:type="spellEnd"/>
+      <w:r>
+        <w:rPr>
+          <w:rFonts w:ascii="Bahnschrift" w:hAnsi="Bahnschrift"/>
+          <w:sz w:val="28"/>
+          <w:szCs w:val="28"/>
+        </w:rPr>
+        <w:t>.</w:t>
       </w:r>
     </w:p>
     <w:p>
@@ -940,6 +1019,7 @@
         </w:rPr>
         <w:t xml:space="preserve"> </w:t>
       </w:r>
+      <w:proofErr w:type="spellStart"/>
       <w:r>
         <w:rPr>
           <w:rFonts w:ascii="Bahnschrift" w:hAnsi="Bahnschrift"/>
@@ -949,6 +1029,7 @@
         </w:rPr>
         <w:t>msle</w:t>
       </w:r>
+      <w:proofErr w:type="spellEnd"/>
       <w:r>
         <w:rPr>
           <w:rFonts w:ascii="Bahnschrift" w:hAnsi="Bahnschrift"/>
@@ -1053,6 +1134,7 @@
           <w:szCs w:val="28"/>
         </w:rPr>
       </w:pPr>
+      <w:proofErr w:type="spellStart"/>
       <w:r>
         <w:rPr>
           <w:rFonts w:ascii="Bahnschrift" w:hAnsi="Bahnschrift"/>
@@ -1062,6 +1144,7 @@
         </w:rPr>
         <w:t>VMVersion</w:t>
       </w:r>
+      <w:proofErr w:type="spellEnd"/>
       <w:r>
         <w:rPr>
           <w:rFonts w:ascii="Bahnschrift" w:hAnsi="Bahnschrift"/>
@@ -1117,14 +1200,25 @@
           <w:szCs w:val="28"/>
         </w:rPr>
       </w:pPr>
-      <w:r>
-        <w:rPr>
-          <w:rFonts w:ascii="Bahnschrift" w:hAnsi="Bahnschrift"/>
-          <w:sz w:val="28"/>
-          <w:szCs w:val="28"/>
-          <w:lang w:val="en-US"/>
-        </w:rPr>
-        <w:t xml:space="preserve">DataSection – </w:t>
+      <w:proofErr w:type="spellStart"/>
+      <w:r>
+        <w:rPr>
+          <w:rFonts w:ascii="Bahnschrift" w:hAnsi="Bahnschrift"/>
+          <w:sz w:val="28"/>
+          <w:szCs w:val="28"/>
+          <w:lang w:val="en-US"/>
+        </w:rPr>
+        <w:t>DataSection</w:t>
+      </w:r>
+      <w:proofErr w:type="spellEnd"/>
+      <w:r>
+        <w:rPr>
+          <w:rFonts w:ascii="Bahnschrift" w:hAnsi="Bahnschrift"/>
+          <w:sz w:val="28"/>
+          <w:szCs w:val="28"/>
+          <w:lang w:val="en-US"/>
+        </w:rPr>
+        <w:t xml:space="preserve"> – </w:t>
       </w:r>
       <w:r>
         <w:rPr>
@@ -1234,6 +1328,7 @@
           <w:szCs w:val="28"/>
         </w:rPr>
       </w:pPr>
+      <w:proofErr w:type="spellStart"/>
       <w:r>
         <w:rPr>
           <w:rFonts w:ascii="Bahnschrift" w:hAnsi="Bahnschrift"/>
@@ -1243,6 +1338,7 @@
         </w:rPr>
         <w:t>CodeSection</w:t>
       </w:r>
+      <w:proofErr w:type="spellEnd"/>
       <w:r>
         <w:rPr>
           <w:rFonts w:ascii="Bahnschrift" w:hAnsi="Bahnschrift"/>
@@ -1278,6 +1374,7 @@
         </w:rPr>
         <w:t xml:space="preserve"> формат команд разный, каждая </w:t>
       </w:r>
+      <w:proofErr w:type="spellStart"/>
       <w:r>
         <w:rPr>
           <w:rFonts w:ascii="Bahnschrift" w:hAnsi="Bahnschrift"/>
@@ -1287,6 +1384,7 @@
         </w:rPr>
         <w:t>vm</w:t>
       </w:r>
+      <w:proofErr w:type="spellEnd"/>
       <w:r>
         <w:rPr>
           <w:rFonts w:ascii="Bahnschrift" w:hAnsi="Bahnschrift"/>
@@ -1318,6 +1416,7 @@
         </w:rPr>
         <w:t xml:space="preserve">Потом идёт запуск </w:t>
       </w:r>
+      <w:proofErr w:type="spellStart"/>
       <w:r>
         <w:rPr>
           <w:rFonts w:ascii="Bahnschrift" w:hAnsi="Bahnschrift"/>
@@ -1327,6 +1426,7 @@
         </w:rPr>
         <w:t>vm</w:t>
       </w:r>
+      <w:proofErr w:type="spellEnd"/>
       <w:r>
         <w:rPr>
           <w:rFonts w:ascii="Bahnschrift" w:hAnsi="Bahnschrift"/>
@@ -1341,7 +1441,25 @@
           <w:sz w:val="28"/>
           <w:szCs w:val="28"/>
         </w:rPr>
-        <w:t>загружает данные и испольняет.</w:t>
+        <w:t xml:space="preserve">загружает данные и </w:t>
+      </w:r>
+      <w:proofErr w:type="spellStart"/>
+      <w:r>
+        <w:rPr>
+          <w:rFonts w:ascii="Bahnschrift" w:hAnsi="Bahnschrift"/>
+          <w:sz w:val="28"/>
+          <w:szCs w:val="28"/>
+        </w:rPr>
+        <w:t>испольняет</w:t>
+      </w:r>
+      <w:proofErr w:type="spellEnd"/>
+      <w:r>
+        <w:rPr>
+          <w:rFonts w:ascii="Bahnschrift" w:hAnsi="Bahnschrift"/>
+          <w:sz w:val="28"/>
+          <w:szCs w:val="28"/>
+        </w:rPr>
+        <w:t>.</w:t>
       </w:r>
     </w:p>
     <w:p>
@@ -1398,6 +1516,7 @@
         </w:rPr>
         <w:t xml:space="preserve"> Придётся в </w:t>
       </w:r>
+      <w:proofErr w:type="spellStart"/>
       <w:r>
         <w:rPr>
           <w:rFonts w:ascii="Bahnschrift" w:hAnsi="Bahnschrift"/>
@@ -1407,6 +1526,7 @@
         </w:rPr>
         <w:t>vm</w:t>
       </w:r>
+      <w:proofErr w:type="spellEnd"/>
       <w:r>
         <w:rPr>
           <w:rFonts w:ascii="Bahnschrift" w:hAnsi="Bahnschrift"/>
@@ -1540,6 +1660,7 @@
         </w:rPr>
         <w:t xml:space="preserve">секция может быть любых размеров, то придётся создать систему </w:t>
       </w:r>
+      <w:proofErr w:type="spellStart"/>
       <w:r>
         <w:rPr>
           <w:rFonts w:ascii="Bahnschrift" w:hAnsi="Bahnschrift"/>
@@ -1549,13 +1670,32 @@
         </w:rPr>
         <w:t>VMConfig</w:t>
       </w:r>
-      <w:r>
-        <w:rPr>
-          <w:rFonts w:ascii="Bahnschrift" w:hAnsi="Bahnschrift"/>
-          <w:sz w:val="28"/>
-          <w:szCs w:val="28"/>
-        </w:rPr>
-        <w:t xml:space="preserve">, которая позволит сохранять границы адресов и тд, которые будут использоваться в проверках, например, в </w:t>
+      <w:proofErr w:type="spellEnd"/>
+      <w:r>
+        <w:rPr>
+          <w:rFonts w:ascii="Bahnschrift" w:hAnsi="Bahnschrift"/>
+          <w:sz w:val="28"/>
+          <w:szCs w:val="28"/>
+        </w:rPr>
+        <w:t xml:space="preserve">, которая позволит сохранять границы адресов и </w:t>
+      </w:r>
+      <w:proofErr w:type="spellStart"/>
+      <w:r>
+        <w:rPr>
+          <w:rFonts w:ascii="Bahnschrift" w:hAnsi="Bahnschrift"/>
+          <w:sz w:val="28"/>
+          <w:szCs w:val="28"/>
+        </w:rPr>
+        <w:t>тд</w:t>
+      </w:r>
+      <w:proofErr w:type="spellEnd"/>
+      <w:r>
+        <w:rPr>
+          <w:rFonts w:ascii="Bahnschrift" w:hAnsi="Bahnschrift"/>
+          <w:sz w:val="28"/>
+          <w:szCs w:val="28"/>
+        </w:rPr>
+        <w:t xml:space="preserve">, которые будут использоваться в проверках, например, в </w:t>
       </w:r>
       <w:r>
         <w:rPr>
@@ -1720,6 +1860,7 @@
         </w:rPr>
         <w:t xml:space="preserve"> просто написать имя линкера в </w:t>
       </w:r>
+      <w:proofErr w:type="spellStart"/>
       <w:r>
         <w:rPr>
           <w:rFonts w:ascii="Bahnschrift" w:hAnsi="Bahnschrift"/>
@@ -1729,6 +1870,7 @@
         </w:rPr>
         <w:t>cmd</w:t>
       </w:r>
+      <w:proofErr w:type="spellEnd"/>
       <w:r>
         <w:rPr>
           <w:rFonts w:ascii="Bahnschrift" w:hAnsi="Bahnschrift"/>
@@ -1822,6 +1964,7 @@
         </w:rPr>
         <w:t>&gt;</w:t>
       </w:r>
+      <w:proofErr w:type="spellStart"/>
       <w:r>
         <w:rPr>
           <w:rFonts w:ascii="Bahnschrift" w:hAnsi="Bahnschrift"/>
@@ -1831,6 +1974,7 @@
         </w:rPr>
         <w:t>msll</w:t>
       </w:r>
+      <w:proofErr w:type="spellEnd"/>
       <w:r>
         <w:rPr>
           <w:rFonts w:ascii="Bahnschrift" w:hAnsi="Bahnschrift"/>
@@ -1865,8 +2009,19 @@
           <w:szCs w:val="28"/>
           <w:lang w:val="en-US"/>
         </w:rPr>
-        <w:t>Enter path to MO file:_</w:t>
-      </w:r>
+        <w:t xml:space="preserve">Enter path to MO </w:t>
+      </w:r>
+      <w:proofErr w:type="gramStart"/>
+      <w:r>
+        <w:rPr>
+          <w:rFonts w:ascii="Bahnschrift" w:hAnsi="Bahnschrift"/>
+          <w:sz w:val="28"/>
+          <w:szCs w:val="28"/>
+          <w:lang w:val="en-US"/>
+        </w:rPr>
+        <w:t>file:_</w:t>
+      </w:r>
+      <w:proofErr w:type="gramEnd"/>
       <w:r>
         <w:rPr>
           <w:rFonts w:ascii="Bahnschrift" w:hAnsi="Bahnschrift"/>
@@ -1942,6 +2097,7 @@
           <w:lang w:val="en-US"/>
         </w:rPr>
       </w:pPr>
+      <w:proofErr w:type="gramStart"/>
       <w:r>
         <w:rPr>
           <w:rFonts w:ascii="Bahnschrift" w:hAnsi="Bahnschrift"/>
@@ -1951,6 +2107,7 @@
         </w:rPr>
         <w:t>:_</w:t>
       </w:r>
+      <w:proofErr w:type="gramEnd"/>
       <w:r>
         <w:rPr>
           <w:rFonts w:ascii="Bahnschrift" w:hAnsi="Bahnschrift"/>
@@ -2023,8 +2180,18 @@
           <w:lang w:val="en-US"/>
         </w:rPr>
         <w:br/>
+      </w:r>
+      <w:proofErr w:type="spellStart"/>
+      <w:r>
+        <w:rPr>
+          <w:rFonts w:ascii="Bahnschrift" w:hAnsi="Bahnschrift"/>
+          <w:sz w:val="28"/>
+          <w:szCs w:val="28"/>
+          <w:lang w:val="en-US"/>
+        </w:rPr>
         <w:t>Deserializated</w:t>
       </w:r>
+      <w:proofErr w:type="spellEnd"/>
     </w:p>
     <w:p>
       <w:pPr>
@@ -2161,7 +2328,38 @@
           <w:szCs w:val="28"/>
           <w:lang w:val="en-US"/>
         </w:rPr>
-        <w:t>msll.exe “C;\Objects\first.mslmo”</w:t>
+        <w:t>msll.exe “</w:t>
+      </w:r>
+      <w:proofErr w:type="gramStart"/>
+      <w:r>
+        <w:rPr>
+          <w:rFonts w:ascii="Bahnschrift" w:hAnsi="Bahnschrift"/>
+          <w:sz w:val="28"/>
+          <w:szCs w:val="28"/>
+          <w:lang w:val="en-US"/>
+        </w:rPr>
+        <w:t>C;\Objects\</w:t>
+      </w:r>
+      <w:proofErr w:type="spellStart"/>
+      <w:r>
+        <w:rPr>
+          <w:rFonts w:ascii="Bahnschrift" w:hAnsi="Bahnschrift"/>
+          <w:sz w:val="28"/>
+          <w:szCs w:val="28"/>
+          <w:lang w:val="en-US"/>
+        </w:rPr>
+        <w:t>first.mslmo</w:t>
+      </w:r>
+      <w:proofErr w:type="spellEnd"/>
+      <w:proofErr w:type="gramEnd"/>
+      <w:r>
+        <w:rPr>
+          <w:rFonts w:ascii="Bahnschrift" w:hAnsi="Bahnschrift"/>
+          <w:sz w:val="28"/>
+          <w:szCs w:val="28"/>
+          <w:lang w:val="en-US"/>
+        </w:rPr>
+        <w:t>”</w:t>
       </w:r>
       <w:r>
         <w:rPr>
@@ -2245,8 +2443,18 @@
           <w:lang w:val="en-US"/>
         </w:rPr>
         <w:br/>
+      </w:r>
+      <w:proofErr w:type="spellStart"/>
+      <w:r>
+        <w:rPr>
+          <w:rFonts w:ascii="Bahnschrift" w:hAnsi="Bahnschrift"/>
+          <w:sz w:val="28"/>
+          <w:szCs w:val="28"/>
+          <w:lang w:val="en-US"/>
+        </w:rPr>
         <w:t>Deserializated</w:t>
       </w:r>
+      <w:proofErr w:type="spellEnd"/>
     </w:p>
     <w:p>
       <w:pPr>
@@ -2372,9 +2580,9 @@
           <w:rFonts w:ascii="Bahnschrift" w:hAnsi="Bahnschrift"/>
           <w:sz w:val="40"/>
           <w:szCs w:val="40"/>
-          <w:lang w:val="en-US"/>
-        </w:rPr>
-      </w:pPr>
+        </w:rPr>
+      </w:pPr>
+      <w:proofErr w:type="spellStart"/>
       <w:r>
         <w:rPr>
           <w:rFonts w:ascii="Bahnschrift" w:hAnsi="Bahnschrift"/>
@@ -2382,43 +2590,72 @@
           <w:szCs w:val="40"/>
         </w:rPr>
         <w:lastRenderedPageBreak/>
-        <w:t>Пайплайн линковки</w:t>
-      </w:r>
-    </w:p>
-    <w:p>
-      <w:pPr>
-        <w:rPr>
-          <w:rFonts w:ascii="Bahnschrift" w:hAnsi="Bahnschrift"/>
-          <w:sz w:val="28"/>
-          <w:szCs w:val="28"/>
-        </w:rPr>
-      </w:pPr>
-      <w:r>
-        <w:rPr>
-          <w:rFonts w:ascii="Bahnschrift" w:hAnsi="Bahnschrift"/>
-          <w:sz w:val="28"/>
-          <w:szCs w:val="28"/>
-        </w:rPr>
-        <w:t>Перед тем, как начать полноценно писать код, следует составить пайплайн линковки.</w:t>
-      </w:r>
-    </w:p>
-    <w:p>
-      <w:pPr>
-        <w:rPr>
-          <w:rFonts w:ascii="Bahnschrift" w:hAnsi="Bahnschrift"/>
-          <w:sz w:val="28"/>
-          <w:szCs w:val="28"/>
-          <w:lang w:val="en-US"/>
-        </w:rPr>
-      </w:pPr>
-      <w:r>
-        <w:rPr>
-          <w:rFonts w:ascii="Bahnschrift" w:hAnsi="Bahnschrift"/>
-          <w:sz w:val="28"/>
-          <w:szCs w:val="28"/>
-        </w:rPr>
         <w:t>Пайплайн</w:t>
       </w:r>
+      <w:proofErr w:type="spellEnd"/>
+      <w:r>
+        <w:rPr>
+          <w:rFonts w:ascii="Bahnschrift" w:hAnsi="Bahnschrift"/>
+          <w:sz w:val="40"/>
+          <w:szCs w:val="40"/>
+        </w:rPr>
+        <w:t xml:space="preserve"> линковки</w:t>
+      </w:r>
+    </w:p>
+    <w:p>
+      <w:pPr>
+        <w:rPr>
+          <w:rFonts w:ascii="Bahnschrift" w:hAnsi="Bahnschrift"/>
+          <w:sz w:val="28"/>
+          <w:szCs w:val="28"/>
+        </w:rPr>
+      </w:pPr>
+      <w:r>
+        <w:rPr>
+          <w:rFonts w:ascii="Bahnschrift" w:hAnsi="Bahnschrift"/>
+          <w:sz w:val="28"/>
+          <w:szCs w:val="28"/>
+        </w:rPr>
+        <w:t xml:space="preserve">Перед тем, как начать полноценно писать код, следует составить </w:t>
+      </w:r>
+      <w:proofErr w:type="spellStart"/>
+      <w:r>
+        <w:rPr>
+          <w:rFonts w:ascii="Bahnschrift" w:hAnsi="Bahnschrift"/>
+          <w:sz w:val="28"/>
+          <w:szCs w:val="28"/>
+        </w:rPr>
+        <w:t>пайплайн</w:t>
+      </w:r>
+      <w:proofErr w:type="spellEnd"/>
+      <w:r>
+        <w:rPr>
+          <w:rFonts w:ascii="Bahnschrift" w:hAnsi="Bahnschrift"/>
+          <w:sz w:val="28"/>
+          <w:szCs w:val="28"/>
+        </w:rPr>
+        <w:t xml:space="preserve"> линковки.</w:t>
+      </w:r>
+    </w:p>
+    <w:p>
+      <w:pPr>
+        <w:rPr>
+          <w:rFonts w:ascii="Bahnschrift" w:hAnsi="Bahnschrift"/>
+          <w:sz w:val="28"/>
+          <w:szCs w:val="28"/>
+          <w:lang w:val="en-US"/>
+        </w:rPr>
+      </w:pPr>
+      <w:proofErr w:type="spellStart"/>
+      <w:r>
+        <w:rPr>
+          <w:rFonts w:ascii="Bahnschrift" w:hAnsi="Bahnschrift"/>
+          <w:sz w:val="28"/>
+          <w:szCs w:val="28"/>
+        </w:rPr>
+        <w:t>Пайплайн</w:t>
+      </w:r>
+      <w:proofErr w:type="spellEnd"/>
       <w:r>
         <w:rPr>
           <w:rFonts w:ascii="Bahnschrift" w:hAnsi="Bahnschrift"/>
@@ -2458,6 +2695,7 @@
         </w:rPr>
         <w:t xml:space="preserve"> </w:t>
       </w:r>
+      <w:proofErr w:type="spellStart"/>
       <w:r>
         <w:rPr>
           <w:rFonts w:ascii="Bahnschrift" w:hAnsi="Bahnschrift"/>
@@ -2467,6 +2705,7 @@
         </w:rPr>
         <w:t>mslmo</w:t>
       </w:r>
+      <w:proofErr w:type="spellEnd"/>
     </w:p>
     <w:p>
       <w:pPr>
@@ -2511,6 +2750,7 @@
         </w:rPr>
         <w:t xml:space="preserve">Запускаем транслятор, передавая туда состояние линковки, путь к директории с файлами (для поиска </w:t>
       </w:r>
+      <w:proofErr w:type="spellStart"/>
       <w:r>
         <w:rPr>
           <w:rFonts w:ascii="Bahnschrift" w:hAnsi="Bahnschrift"/>
@@ -2520,13 +2760,50 @@
         </w:rPr>
         <w:t>mslco</w:t>
       </w:r>
-      <w:r>
-        <w:rPr>
-          <w:rFonts w:ascii="Bahnschrift" w:hAnsi="Bahnschrift"/>
-          <w:sz w:val="28"/>
-          <w:szCs w:val="28"/>
-        </w:rPr>
-        <w:t>), экземляр десериализатора.</w:t>
+      <w:proofErr w:type="spellEnd"/>
+      <w:r>
+        <w:rPr>
+          <w:rFonts w:ascii="Bahnschrift" w:hAnsi="Bahnschrift"/>
+          <w:sz w:val="28"/>
+          <w:szCs w:val="28"/>
+        </w:rPr>
+        <w:t xml:space="preserve">), </w:t>
+      </w:r>
+      <w:proofErr w:type="spellStart"/>
+      <w:r>
+        <w:rPr>
+          <w:rFonts w:ascii="Bahnschrift" w:hAnsi="Bahnschrift"/>
+          <w:sz w:val="28"/>
+          <w:szCs w:val="28"/>
+        </w:rPr>
+        <w:t>экземляр</w:t>
+      </w:r>
+      <w:proofErr w:type="spellEnd"/>
+      <w:r>
+        <w:rPr>
+          <w:rFonts w:ascii="Bahnschrift" w:hAnsi="Bahnschrift"/>
+          <w:sz w:val="28"/>
+          <w:szCs w:val="28"/>
+        </w:rPr>
+        <w:t xml:space="preserve"> </w:t>
+      </w:r>
+      <w:proofErr w:type="spellStart"/>
+      <w:r>
+        <w:rPr>
+          <w:rFonts w:ascii="Bahnschrift" w:hAnsi="Bahnschrift"/>
+          <w:sz w:val="28"/>
+          <w:szCs w:val="28"/>
+        </w:rPr>
+        <w:t>десериализатора</w:t>
+      </w:r>
+      <w:proofErr w:type="spellEnd"/>
+      <w:r>
+        <w:rPr>
+          <w:rFonts w:ascii="Bahnschrift" w:hAnsi="Bahnschrift"/>
+          <w:sz w:val="28"/>
+          <w:szCs w:val="28"/>
+        </w:rPr>
+        <w:t>.</w:t>
       </w:r>
     </w:p>
     <w:p>
@@ -2550,6 +2827,7 @@
         </w:rPr>
         <w:t xml:space="preserve">Создаём структуру </w:t>
       </w:r>
+      <w:proofErr w:type="spellStart"/>
       <w:r>
         <w:rPr>
           <w:rFonts w:ascii="Bahnschrift" w:hAnsi="Bahnschrift"/>
@@ -2559,6 +2837,7 @@
         </w:rPr>
         <w:t>ExecutionData</w:t>
       </w:r>
+      <w:proofErr w:type="spellEnd"/>
       <w:r>
         <w:rPr>
           <w:rFonts w:ascii="Bahnschrift" w:hAnsi="Bahnschrift"/>
@@ -2697,6 +2976,7 @@
         </w:rPr>
         <w:t xml:space="preserve">в </w:t>
       </w:r>
+      <w:proofErr w:type="spellStart"/>
       <w:r>
         <w:rPr>
           <w:rFonts w:ascii="Bahnschrift" w:hAnsi="Bahnschrift"/>
@@ -2706,6 +2986,7 @@
         </w:rPr>
         <w:t>ExecutionData</w:t>
       </w:r>
+      <w:proofErr w:type="spellEnd"/>
       <w:r>
         <w:rPr>
           <w:rFonts w:ascii="Bahnschrift" w:hAnsi="Bahnschrift"/>
@@ -2885,24 +3166,103 @@
           <w:sz w:val="28"/>
           <w:szCs w:val="28"/>
         </w:rPr>
-        <w:t xml:space="preserve"> смещение в байткоде – символ. Во время трансляции байткода транслятор будет проверять </w:t>
-      </w:r>
-      <w:r>
-        <w:rPr>
-          <w:rFonts w:ascii="Bahnschrift" w:hAnsi="Bahnschrift"/>
-          <w:sz w:val="28"/>
-          <w:szCs w:val="28"/>
-          <w:lang w:val="en-US"/>
-        </w:rPr>
-        <w:t>ip</w:t>
-      </w:r>
-      <w:r>
-        <w:rPr>
-          <w:rFonts w:ascii="Bahnschrift" w:hAnsi="Bahnschrift"/>
-          <w:sz w:val="28"/>
-          <w:szCs w:val="28"/>
-        </w:rPr>
-        <w:t xml:space="preserve"> команды, если есть в таблице – сверяем обрабатываемые файлы/модули. Помечаем символ как </w:t>
+        <w:t xml:space="preserve"> смещение в </w:t>
+      </w:r>
+      <w:proofErr w:type="spellStart"/>
+      <w:r>
+        <w:rPr>
+          <w:rFonts w:ascii="Bahnschrift" w:hAnsi="Bahnschrift"/>
+          <w:sz w:val="28"/>
+          <w:szCs w:val="28"/>
+        </w:rPr>
+        <w:t>байткоде</w:t>
+      </w:r>
+      <w:proofErr w:type="spellEnd"/>
+      <w:r>
+        <w:rPr>
+          <w:rFonts w:ascii="Bahnschrift" w:hAnsi="Bahnschrift"/>
+          <w:sz w:val="28"/>
+          <w:szCs w:val="28"/>
+        </w:rPr>
+        <w:t xml:space="preserve"> – символ. Во время трансляции </w:t>
+      </w:r>
+      <w:proofErr w:type="spellStart"/>
+      <w:r>
+        <w:rPr>
+          <w:rFonts w:ascii="Bahnschrift" w:hAnsi="Bahnschrift"/>
+          <w:sz w:val="28"/>
+          <w:szCs w:val="28"/>
+        </w:rPr>
+        <w:t>байткода</w:t>
+      </w:r>
+      <w:proofErr w:type="spellEnd"/>
+      <w:r>
+        <w:rPr>
+          <w:rFonts w:ascii="Bahnschrift" w:hAnsi="Bahnschrift"/>
+          <w:sz w:val="28"/>
+          <w:szCs w:val="28"/>
+        </w:rPr>
+        <w:t xml:space="preserve"> транслятор будет проверять команды, если </w:t>
+      </w:r>
+      <w:proofErr w:type="spellStart"/>
+      <w:r>
+        <w:rPr>
+          <w:rFonts w:ascii="Bahnschrift" w:hAnsi="Bahnschrift"/>
+          <w:sz w:val="28"/>
+          <w:szCs w:val="28"/>
+        </w:rPr>
+        <w:t>выстречается</w:t>
+      </w:r>
+      <w:proofErr w:type="spellEnd"/>
+      <w:r>
+        <w:rPr>
+          <w:rFonts w:ascii="Bahnschrift" w:hAnsi="Bahnschrift"/>
+          <w:sz w:val="28"/>
+          <w:szCs w:val="28"/>
+        </w:rPr>
+        <w:t xml:space="preserve"> </w:t>
+      </w:r>
+      <w:r>
+        <w:rPr>
+          <w:rFonts w:ascii="Bahnschrift" w:hAnsi="Bahnschrift"/>
+          <w:sz w:val="28"/>
+          <w:szCs w:val="28"/>
+          <w:lang w:val="en-US"/>
+        </w:rPr>
+        <w:t>SYMBOL</w:t>
+      </w:r>
+      <w:r>
+        <w:rPr>
+          <w:rFonts w:ascii="Bahnschrift" w:hAnsi="Bahnschrift"/>
+          <w:sz w:val="28"/>
+          <w:szCs w:val="28"/>
+        </w:rPr>
+        <w:t>_</w:t>
+      </w:r>
+      <w:r>
+        <w:rPr>
+          <w:rFonts w:ascii="Bahnschrift" w:hAnsi="Bahnschrift"/>
+          <w:sz w:val="28"/>
+          <w:szCs w:val="28"/>
+          <w:lang w:val="en-US"/>
+        </w:rPr>
+        <w:t>LABEL</w:t>
+      </w:r>
+      <w:r>
+        <w:rPr>
+          <w:rFonts w:ascii="Bahnschrift" w:hAnsi="Bahnschrift"/>
+          <w:sz w:val="28"/>
+          <w:szCs w:val="28"/>
+        </w:rPr>
+        <w:t xml:space="preserve"> и аргумент-идентификатор </w:t>
+      </w:r>
+      <w:r>
+        <w:rPr>
+          <w:rFonts w:ascii="Bahnschrift" w:hAnsi="Bahnschrift"/>
+          <w:sz w:val="28"/>
+          <w:szCs w:val="28"/>
+        </w:rPr>
+        <w:t xml:space="preserve">есть в таблице – сверяем обрабатываемые файлы/модули. Помечаем символ как </w:t>
       </w:r>
       <w:r>
         <w:rPr>
@@ -3176,6 +3536,7 @@
         </w:rPr>
         <w:t xml:space="preserve">индексов и склеивания путей обрабатываем все </w:t>
       </w:r>
+      <w:proofErr w:type="spellStart"/>
       <w:r>
         <w:rPr>
           <w:rFonts w:ascii="Bahnschrift" w:hAnsi="Bahnschrift"/>
@@ -3185,6 +3546,7 @@
         </w:rPr>
         <w:t>mslco</w:t>
       </w:r>
+      <w:proofErr w:type="spellEnd"/>
       <w:r>
         <w:rPr>
           <w:rFonts w:ascii="Bahnschrift" w:hAnsi="Bahnschrift"/>
@@ -3210,6 +3572,7 @@
         </w:rPr>
         <w:t xml:space="preserve"> команда загружается в </w:t>
       </w:r>
+      <w:proofErr w:type="gramStart"/>
       <w:r>
         <w:rPr>
           <w:rFonts w:ascii="Bahnschrift" w:hAnsi="Bahnschrift"/>
@@ -3227,6 +3590,7 @@
         </w:rPr>
         <w:t>::</w:t>
       </w:r>
+      <w:proofErr w:type="gramEnd"/>
       <w:r>
         <w:rPr>
           <w:rFonts w:ascii="Bahnschrift" w:hAnsi="Bahnschrift"/>
@@ -3244,6 +3608,7 @@
         </w:rPr>
         <w:t xml:space="preserve">. После обработки всех команд вся информация копируется в байтовый массив </w:t>
       </w:r>
+      <w:proofErr w:type="spellStart"/>
       <w:r>
         <w:rPr>
           <w:rFonts w:ascii="Bahnschrift" w:hAnsi="Bahnschrift"/>
@@ -3253,6 +3618,7 @@
         </w:rPr>
         <w:t>ExecutionData</w:t>
       </w:r>
+      <w:proofErr w:type="spellEnd"/>
       <w:r>
         <w:rPr>
           <w:rFonts w:ascii="Bahnschrift" w:hAnsi="Bahnschrift"/>
@@ -3308,6 +3674,7 @@
         </w:rPr>
         <w:t xml:space="preserve"> </w:t>
       </w:r>
+      <w:proofErr w:type="spellStart"/>
       <w:r>
         <w:rPr>
           <w:rFonts w:ascii="Bahnschrift" w:hAnsi="Bahnschrift"/>
@@ -3317,6 +3684,7 @@
         </w:rPr>
         <w:t>msli</w:t>
       </w:r>
+      <w:proofErr w:type="spellEnd"/>
       <w:r>
         <w:rPr>
           <w:rFonts w:ascii="Bahnschrift" w:hAnsi="Bahnschrift"/>
@@ -3408,6 +3776,7 @@
         </w:rPr>
         <w:t xml:space="preserve"> тип </w:t>
       </w:r>
+      <w:proofErr w:type="spellStart"/>
       <w:r>
         <w:rPr>
           <w:rFonts w:ascii="Bahnschrift" w:hAnsi="Bahnschrift"/>
@@ -3417,13 +3786,32 @@
         </w:rPr>
         <w:t>vm</w:t>
       </w:r>
-      <w:r>
-        <w:rPr>
-          <w:rFonts w:ascii="Bahnschrift" w:hAnsi="Bahnschrift"/>
-          <w:sz w:val="28"/>
-          <w:szCs w:val="28"/>
-        </w:rPr>
-        <w:t>, смещение констант, смещение команд вм.</w:t>
+      <w:proofErr w:type="spellEnd"/>
+      <w:r>
+        <w:rPr>
+          <w:rFonts w:ascii="Bahnschrift" w:hAnsi="Bahnschrift"/>
+          <w:sz w:val="28"/>
+          <w:szCs w:val="28"/>
+        </w:rPr>
+        <w:t xml:space="preserve">, смещение констант, смещение команд </w:t>
+      </w:r>
+      <w:proofErr w:type="spellStart"/>
+      <w:r>
+        <w:rPr>
+          <w:rFonts w:ascii="Bahnschrift" w:hAnsi="Bahnschrift"/>
+          <w:sz w:val="28"/>
+          <w:szCs w:val="28"/>
+        </w:rPr>
+        <w:t>вм</w:t>
+      </w:r>
+      <w:proofErr w:type="spellEnd"/>
+      <w:r>
+        <w:rPr>
+          <w:rFonts w:ascii="Bahnschrift" w:hAnsi="Bahnschrift"/>
+          <w:sz w:val="28"/>
+          <w:szCs w:val="28"/>
+        </w:rPr>
+        <w:t>.</w:t>
       </w:r>
     </w:p>
     <w:p>

</xml_diff>